<commit_message>
fix(templates): conclusioni ultimo capitolo e titoli uniformi nei report audit
- Riordina sezione 11: RILIEVI/contatori prima, Conclusioni per ultime
- Uniforma trattino en-dash nei titoli capitolo (N – TITOLO)
- Corregge &apos; in apostrofo (ISO 14001) e ripristina Titolo1 su ESITO se assente
- Script patch-audit-template-structure.cjs + generatori allineati (9001/14001/3834)

Co-authored-by: QS Studio <marcocamellini@qsstudio241.onmicrosoft.com>
</commit_message>
<xml_diff>
--- a/app/public/templates/ISO14001-audit-report.docx
+++ b/app/public/templates/ISO14001-audit-report.docx
@@ -41,7 +41,7 @@
         <w:spacing w:before="0" w:after="300"/>
       </w:pPr>
       <w:r>
-        <w:t xml:space="preserve">1 — DATI GENERALI</w:t>
+        <w:t xml:space="preserve">1 – DATI GENERALI</w:t>
       </w:r>
     </w:p>
     <w:tbl>
@@ -478,7 +478,7 @@
         <w:spacing w:before="0" w:after="300"/>
       </w:pPr>
       <w:r>
-        <w:t xml:space="preserve">2 — OBIETTIVO DELL'AUDIT</w:t>
+        <w:t xml:space="preserve">2 – OBIETTIVO DELL'AUDIT</w:t>
       </w:r>
     </w:p>
     <w:p>
@@ -666,24 +666,7 @@
         <w:spacing w:before="0" w:after="300"/>
       </w:pPr>
       <w:r>
-        <w:t xml:space="preserve">11 — ESITO DELL'AUDIT</w:t>
-      </w:r>
-    </w:p>
-    <w:p>
-      <w:pPr>
-        <w:pStyle w:val="Titolo2"/>
-        <w:spacing w:before="200" w:after="150"/>
-      </w:pPr>
-      <w:r>
-        <w:t xml:space="preserve">Conclusioni</w:t>
-      </w:r>
-    </w:p>
-    <w:p>
-      <w:pPr>
-        <w:spacing w:after="300"/>
-      </w:pPr>
-      <w:r>
-        <w:t xml:space="preserve">{conclusions}</w:t>
+        <w:t xml:space="preserve">11 – ESITO DELL'AUDIT</w:t>
       </w:r>
     </w:p>
     <w:p>
@@ -948,6 +931,23 @@
       </w:pPr>
       <w:r>
         <w:t xml:space="preserve">{summaryText}</w:t>
+      </w:r>
+    </w:p>
+    <w:p>
+      <w:pPr>
+        <w:pStyle w:val="Titolo2"/>
+        <w:spacing w:before="200" w:after="150"/>
+      </w:pPr>
+      <w:r>
+        <w:t xml:space="preserve">Conclusioni</w:t>
+      </w:r>
+    </w:p>
+    <w:p>
+      <w:pPr>
+        <w:spacing w:after="300"/>
+      </w:pPr>
+      <w:r>
+        <w:t xml:space="preserve">{conclusions}</w:t>
       </w:r>
     </w:p>
     <w:sectPr>

</xml_diff>